<commit_message>
Update methodology.docx for consistent engagement thresholds
- Updated Stage 2 engagement filter description: now lists all platforms
  (social >= 2 likes/upvotes, review >= 1 helpful vote, editorial = none)
- Updated Silent Majority limitation section with same platform-specific
  threshold details
- Old text referenced only Reddit (>=3) and YouTube (>=2)

Co-Authored-By: Claude Opus 4.6 (1M context) <noreply@anthropic.com>
</commit_message>
<xml_diff>
--- a/docs/methodology.docx
+++ b/docs/methodology.docx
@@ -830,7 +830,7 @@
         <w:rPr>
           <w:rFonts w:ascii="Lato" w:hAnsi="Lato" w:cs="Lato"/>
         </w:rPr>
-        <w:t>Low-engagement items are removed before analysis. Reddit posts and comments need at least 3 upvotes; YouTube comments need at least 2 likes. Content below these thresholds is typically noise — bot posts, spam, or one-off comments with no community resonance. Removing them improves the quality of everything downstream.</w:t>
+        <w:t>Low-engagement items are removed before analysis. Social media comments (Reddit, YouTube, Twitter, Instagram) need at least 2 likes or upvotes. Amazon and Flipkart reviews need at least 1 helpful vote. News, academic, and web search results have no engagement threshold. Content below these thresholds is typically noise — bot posts, spam, or one-off comments with no community resonance. Removing them improves the quality of everything downstream.</w:t>
       </w:r>
     </w:p>
     <w:p>
@@ -3876,7 +3876,7 @@
     <w:p>
       <w:pPr/>
       <w:r>
-        <w:t>Minimum engagement thresholds (upvotes, likes) systematically exclude moderate, quiet consumers. The corpus over-represents vocal, opinionated consumers in both directions - strong advocates and strong detractors. The typical consumer who uses a product without strong feelings is unlikely to appear in the data. This means sentiment distributions will appear more polarised than the true population, and Net Sentiment Scores should be interpreted as reflecting the vocal consumer segment, not the total market.</w:t>
+        <w:t>Engagement thresholds are applied consistently across all social and review platforms. Social platforms (Reddit, YouTube, Twitter, Instagram) require a minimum of 2 likes or upvotes. Review platforms (Amazon, Flipkart) require at least 1 helpful vote. News, academic, and web search content has no threshold. These thresholds systematically exclude moderate, quiet consumers. The corpus over-represents vocal, opinionated consumers in both directions - strong advocates and strong detractors. The typical consumer who uses a product without strong feelings is unlikely to appear in the data. This means sentiment distributions will appear more polarised than the true population, and Net Sentiment Scores should be interpreted as reflecting the vocal consumer segment, not the total market.</w:t>
       </w:r>
     </w:p>
     <w:p>

</xml_diff>

<commit_message>
Document LLM non-determinism as limitation #13 (MITIGATED)
Added to README.md, CLAUDE.md, and docs/methodology.docx. Documents that
same corpus can produce slightly different themes across runs due to model
inference variance. Code-level sources fixed; remaining variance is inherent
to LLM inference.

Co-Authored-By: Claude Opus 4.6 (1M context) <noreply@anthropic.com>
</commit_message>
<xml_diff>
--- a/docs/methodology.docx
+++ b/docs/methodology.docx
@@ -4947,6 +4947,39 @@
           <w:rFonts w:ascii="Lato" w:hAnsi="Lato" w:cs="Lato"/>
         </w:rPr>
       </w:pPr>
+    </w:p>
+    <w:p>
+      <w:pPr>
+        <w:pStyle w:val="Heading3"/>
+      </w:pPr>
+      <w:r>
+        <w:rPr>
+          <w:rFonts w:ascii="Lato" w:hAnsi="Lato"/>
+        </w:rPr>
+        <w:t>LLM Non-Determinism in Theme Extraction</w:t>
+      </w:r>
+    </w:p>
+    <w:p>
+      <w:pPr>
+        <w:pStyle w:val="Normal"/>
+      </w:pPr>
+      <w:r>
+        <w:rPr>
+          <w:rFonts w:ascii="Lato" w:hAnsi="Lato"/>
+        </w:rPr>
+        <w:t>LLM-based theme extraction is inherently non-deterministic. The same corpus can produce slightly different theme assignments across runs because large language models do not guarantee identical outputs even at temperature zero, due to floating-point arithmetic in GPU inference.</w:t>
+      </w:r>
+    </w:p>
+    <w:p>
+      <w:pPr>
+        <w:pStyle w:val="Normal"/>
+      </w:pPr>
+      <w:r>
+        <w:rPr>
+          <w:rFonts w:ascii="Lato" w:hAnsi="Lato"/>
+        </w:rPr>
+        <w:t>Code-level sources of non-determinism have been mitigated: keyword expansion is pinned to temperature 0.0 (previously 0.3), theme discovery samples are sorted by item ID before sampling to eliminate order dependence, theme mapping batches are sorted by item ID, and the Gemini fallback model is pinned to a dated version. Remaining variance comes from model inference itself and cannot be eliminated in code. In practice, theme labels and boundaries may shift slightly between runs, but the overall findings and scoring remain stable.</w:t>
+      </w:r>
     </w:p>
     <w:p>
       <w:pPr>

</xml_diff>

<commit_message>
Fix DOCX formatting: limitations no longer rendered as headings
Limitation lines (5, 6, etc.) with severity markers were being
detected as section headings due to starting with a digit. Tightened
heading detection to exclude lines containing CRITICAL/MEDIUM/HIGH/LOW.

Co-Authored-By: Claude Opus 4.6 (1M context) <noreply@anthropic.com>
</commit_message>
<xml_diff>
--- a/docs/methodology.docx
+++ b/docs/methodology.docx
@@ -845,7 +845,7 @@
     </w:p>
     <w:p>
       <w:pPr>
-        <w:pStyle w:val="Heading1"/>
+        <w:pStyle w:val="ListNumber"/>
       </w:pPr>
       <w:r>
         <w:t>5. No bot/astroturf detection (MEDIUM): Zero coordinated campaign detection.</w:t>
@@ -853,7 +853,7 @@
     </w:p>
     <w:p>
       <w:pPr>
-        <w:pStyle w:val="Heading1"/>
+        <w:pStyle w:val="ListNumber"/>
       </w:pPr>
       <w:r>
         <w:t>6. Sarcasm/irony misclassification (MEDIUM): LLM may read sarcasm as literal.</w:t>

</xml_diff>

<commit_message>
Fix limitation rendering: use plain paragraphs instead of List Number
List Number style was inheriting large font in some Word templates,
causing limitations 5 and 6 to render oversized. All limitations
now use plain Normal paragraph style.

Co-Authored-By: Claude Opus 4.6 (1M context) <noreply@anthropic.com>
</commit_message>
<xml_diff>
--- a/docs/methodology.docx
+++ b/docs/methodology.docx
@@ -812,113 +812,71 @@
       </w:r>
     </w:p>
     <w:p>
-      <w:pPr>
-        <w:pStyle w:val="ListNumber"/>
-      </w:pPr>
       <w:r>
         <w:t>1. Query framing bias (CRITICAL): Keywords presuppose contexts. No adversarial or blank-slate queries.</w:t>
       </w:r>
     </w:p>
     <w:p>
-      <w:pPr>
-        <w:pStyle w:val="ListNumber"/>
-      </w:pPr>
       <w:r>
         <w:t>2. Platform demographic bias (MEDIUM): Reddit skews male/urban/18-34, Twitter politically engaged, YouTube extreme reactions, Instagram female/influencer-driven. No weighting applied.</w:t>
       </w:r>
     </w:p>
     <w:p>
-      <w:pPr>
-        <w:pStyle w:val="ListNumber"/>
-      </w:pPr>
       <w:r>
         <w:t>3. No sampling frame (HIGH, inherent): Prevalence is within-corpus only, never projectable.</w:t>
       </w:r>
     </w:p>
     <w:p>
-      <w:pPr>
-        <w:pStyle w:val="ListNumber"/>
-      </w:pPr>
       <w:r>
         <w:t>4. Engagement filter and the silent majority (MEDIUM, MITIGATED): Hard thresholds removed. Thread cap random. Collectors still fetch visibility-ranked content.</w:t>
       </w:r>
     </w:p>
     <w:p>
-      <w:pPr>
-        <w:pStyle w:val="ListNumber"/>
-      </w:pPr>
       <w:r>
         <w:t>5. No bot/astroturf detection (MEDIUM): Zero coordinated campaign detection.</w:t>
       </w:r>
     </w:p>
     <w:p>
-      <w:pPr>
-        <w:pStyle w:val="ListNumber"/>
-      </w:pPr>
       <w:r>
         <w:t>6. Sarcasm/irony misclassification (MEDIUM): LLM may read sarcasm as literal.</w:t>
       </w:r>
     </w:p>
     <w:p>
-      <w:pPr>
-        <w:pStyle w:val="ListNumber"/>
-      </w:pPr>
       <w:r>
         <w:t>7. Influencer vs authentic voice conflated (MEDIUM): No sponsored content detection.</w:t>
       </w:r>
     </w:p>
     <w:p>
-      <w:pPr>
-        <w:pStyle w:val="ListNumber"/>
-      </w:pPr>
       <w:r>
         <w:t>8. Near-duplicate inflation (LOW): SHA-256 dedup catches exact copies but not paraphrases.</w:t>
       </w:r>
     </w:p>
     <w:p>
-      <w:pPr>
-        <w:pStyle w:val="ListNumber"/>
-      </w:pPr>
       <w:r>
         <w:t>9. Language classification accuracy unvalidated (LOW): LLM processes any language. Accuracy validated on English and Hindi/Hinglish only.</w:t>
       </w:r>
     </w:p>
     <w:p>
-      <w:pPr>
-        <w:pStyle w:val="ListNumber"/>
-      </w:pPr>
       <w:r>
         <w:t>10. No temporal weighting in theme extraction (LOW): Old viral threads count equally.</w:t>
       </w:r>
     </w:p>
     <w:p>
-      <w:pPr>
-        <w:pStyle w:val="ListNumber"/>
-      </w:pPr>
       <w:r>
         <w:t>11. Cross-theme interactions not surfaced (MEDIUM): Items multi-coded but insights one-per-theme.</w:t>
       </w:r>
     </w:p>
     <w:p>
-      <w:pPr>
-        <w:pStyle w:val="ListNumber"/>
-      </w:pPr>
       <w:r>
         <w:t>12. No reliable demographic data (CRITICAL, inherent): No verified age, gender, or location.</w:t>
       </w:r>
     </w:p>
     <w:p>
-      <w:pPr>
-        <w:pStyle w:val="ListNumber"/>
-      </w:pPr>
       <w:r>
         <w:t>13. LLM non-determinism in theme extraction (MEDIUM, MITIGATED): Code-level variance fixed. Model inference variance inherent.</w:t>
       </w:r>
     </w:p>
     <w:p>
-      <w:pPr>
-        <w:pStyle w:val="ListNumber"/>
-      </w:pPr>
       <w:r>
         <w:t>14. Geographic relevance not verified (LOW): No verified geolocation. 2-3% of items may be from non-target markets.</w:t>
       </w:r>

</xml_diff>